<commit_message>
feat(billing): implement billing, payment and credit services
</commit_message>
<xml_diff>
--- a/b2b_billing_and_payment_report.docx
+++ b/b2b_billing_and_payment_report.docx
@@ -550,6 +550,60 @@
         <w:t>3. Khảo Sát Tích Hợp Hệ Thống &amp; Điểm Cần Lưu Ý</w:t>
       </w:r>
     </w:p>
+    <w:p>
+      <w:pPr>
+        <w:pStyle w:val="ListBullet"/>
+      </w:pPr>
+      <w:r>
+        <w:rPr>
+          <w:b/>
+          <w:sz w:val="21"/>
+        </w:rPr>
+        <w:t xml:space="preserve">Chu kỳ đăng ký (Monthly &amp; Yearly): </w:t>
+      </w:r>
+      <w:r>
+        <w:rPr>
+          <w:sz w:val="21"/>
+        </w:rPr>
+        <w:t>Vẫn được lưu giữ độc lập và kiểm soát trọn vẹn trong luồng subscription thông thường.</w:t>
+      </w:r>
+    </w:p>
+    <w:p>
+      <w:pPr>
+        <w:pStyle w:val="ListBullet"/>
+      </w:pPr>
+      <w:r>
+        <w:rPr>
+          <w:b/>
+          <w:sz w:val="21"/>
+        </w:rPr>
+        <w:t xml:space="preserve">Hạn mức Voice Cloning: </w:t>
+      </w:r>
+      <w:r>
+        <w:rPr>
+          <w:sz w:val="21"/>
+        </w:rPr>
+        <w:t>Hoạt động hoàn toàn qua cơ chế lỗi VOICE_CLONE_LIMIT_EXCEEDED, đảm bảo các worker AI có thể tự động fallback sang Standard TTS mà không cần sửa code ở các service khác.</w:t>
+      </w:r>
+    </w:p>
+    <w:p>
+      <w:pPr>
+        <w:pStyle w:val="ListBullet"/>
+      </w:pPr>
+      <w:r>
+        <w:rPr>
+          <w:b/>
+          <w:sz w:val="21"/>
+        </w:rPr>
+        <w:t xml:space="preserve">Mã Stripe Price ID: </w:t>
+      </w:r>
+      <w:r>
+        <w:rPr>
+          <w:sz w:val="21"/>
+        </w:rPr>
+        <w:t>Đảm bảo đăng ký khớp mã sản phẩm và Price ID trên hệ thống Stripe Dashboard để đồng bộ hóa đơn thanh toán cho Subscription.</w:t>
+      </w:r>
+    </w:p>
     <w:sectPr>
       <w:pgSz w:w="12240" w:h="15840"/>
       <w:pgMar w:top="1440" w:right="1440" w:bottom="1440" w:left="1440" w:header="720" w:footer="720" w:gutter="0"/>

</xml_diff>